<commit_message>
fix(articulo): declara que el 90,8% de IJIT queda tras muro de pago
Publicar en IJIT (Springer) no cobra APC, pero el articulo queda cerrado:
648 de 714 articulos desde 2025 estan tras muro de pago (OpenAlex). Abrirlo
por Open Choice cuesta USD 3.390. Visibilidad 8->7, total 82,0->79,5.

Co-Authored-By: Claude Opus 5 <noreply@anthropic.com>
Claude-Session: https://claude.ai/code/session_0118CSEqQvxD2LbN5hkqoZC6
</commit_message>
<xml_diff>
--- a/docs/entregables/09-matriz-revistas/Matriz-decision-revistas.docx
+++ b/docs/entregables/09-matriz-revistas/Matriz-decision-revistas.docx
@@ -2099,7 +2099,7 @@
                 <w:color w:val="FFFFFF"/>
                 <w:sz w:val="16"/>
               </w:rPr>
-              <w:t>IJIT</w:t>
+              <w:t>ISJ</w:t>
             </w:r>
           </w:p>
         </w:tc>
@@ -2116,7 +2116,7 @@
                 <w:color w:val="FFFFFF"/>
                 <w:sz w:val="16"/>
               </w:rPr>
-              <w:t>ISJ</w:t>
+              <w:t>IJIT</w:t>
             </w:r>
           </w:p>
         </w:tc>
@@ -2283,7 +2283,7 @@
                 <w:color w:val="131B2E"/>
                 <w:sz w:val="15"/>
               </w:rPr>
-              <w:t>8</w:t>
+              <w:t>9</w:t>
             </w:r>
           </w:p>
         </w:tc>
@@ -2303,7 +2303,7 @@
                 <w:color w:val="131B2E"/>
                 <w:sz w:val="15"/>
               </w:rPr>
-              <w:t>9</w:t>
+              <w:t>8</w:t>
             </w:r>
           </w:p>
         </w:tc>
@@ -2500,7 +2500,7 @@
                 <w:color w:val="131B2E"/>
                 <w:sz w:val="15"/>
               </w:rPr>
-              <w:t>8</w:t>
+              <w:t>7</w:t>
             </w:r>
           </w:p>
         </w:tc>
@@ -2677,7 +2677,7 @@
                 <w:color w:val="131B2E"/>
                 <w:sz w:val="15"/>
               </w:rPr>
-              <w:t>8</w:t>
+              <w:t>6</w:t>
             </w:r>
           </w:p>
         </w:tc>
@@ -2697,7 +2697,7 @@
                 <w:color w:val="131B2E"/>
                 <w:sz w:val="15"/>
               </w:rPr>
-              <w:t>6</w:t>
+              <w:t>8</w:t>
             </w:r>
           </w:p>
         </w:tc>
@@ -3308,7 +3308,7 @@
                 <w:color w:val="131B2E"/>
                 <w:sz w:val="15"/>
               </w:rPr>
-              <w:t>82.0</w:t>
+              <w:t>81.0</w:t>
             </w:r>
             <w:r>
               <w:rPr>
@@ -3342,7 +3342,7 @@
                 <w:color w:val="131B2E"/>
                 <w:sz w:val="15"/>
               </w:rPr>
-              <w:t>81.0</w:t>
+              <w:t>79.5</w:t>
             </w:r>
             <w:r>
               <w:rPr>
@@ -4096,7 +4096,7 @@
                 <w:color w:val="131B2E"/>
                 <w:sz w:val="15"/>
               </w:rPr>
-              <w:t>IJIT</w:t>
+              <w:t>ISJ</w:t>
             </w:r>
           </w:p>
         </w:tc>
@@ -4116,7 +4116,7 @@
                 <w:color w:val="131B2E"/>
                 <w:sz w:val="15"/>
               </w:rPr>
-              <w:t>82.0</w:t>
+              <w:t>81.0</w:t>
             </w:r>
           </w:p>
         </w:tc>
@@ -4136,7 +4136,6 @@
                 <w:color w:val="131B2E"/>
                 <w:sz w:val="15"/>
               </w:rPr>
-              <w:t xml:space="preserve">Volumen comparable con respaldo de Springer, que elimina el riesgo de descontinuación, y </w:t>
             </w:r>
             <w:r>
               <w:rPr>
@@ -4144,7 +4143,7 @@
                 <w:color w:val="131B2E"/>
                 <w:sz w:val="15"/>
               </w:rPr>
-              <w:t>sin APC</w:t>
+              <w:t>No exige APC</w:t>
             </w:r>
             <w:r>
               <w:rPr>
@@ -4152,7 +4151,7 @@
                 <w:color w:val="131B2E"/>
                 <w:sz w:val="15"/>
               </w:rPr>
-              <w:t xml:space="preserve"> por la vía de suscripción. Su tiempo de revisión está sin verificar.</w:t>
+              <w:t xml:space="preserve"> por la vía de suscripción. Sube al primer puesto al corregirse su capacidad, que no era de 21 artículos al año sino de 35-38. Su puntaje es el más frágil del conjunto: 0 de 6 datos verificados en la revista.</w:t>
             </w:r>
           </w:p>
         </w:tc>
@@ -4194,7 +4193,7 @@
                 <w:color w:val="131B2E"/>
                 <w:sz w:val="15"/>
               </w:rPr>
-              <w:t>ISJ</w:t>
+              <w:t>IJIT</w:t>
             </w:r>
           </w:p>
         </w:tc>
@@ -4214,7 +4213,7 @@
                 <w:color w:val="131B2E"/>
                 <w:sz w:val="15"/>
               </w:rPr>
-              <w:t>81.0</w:t>
+              <w:t>79.5</w:t>
             </w:r>
           </w:p>
         </w:tc>
@@ -4234,6 +4233,7 @@
                 <w:color w:val="131B2E"/>
                 <w:sz w:val="15"/>
               </w:rPr>
+              <w:t xml:space="preserve">Volumen comparable con respaldo de Springer, que elimina el riesgo de descontinuación, y </w:t>
             </w:r>
             <w:r>
               <w:rPr>
@@ -4241,7 +4241,7 @@
                 <w:color w:val="131B2E"/>
                 <w:sz w:val="15"/>
               </w:rPr>
-              <w:t>No exige APC</w:t>
+              <w:t>sin APC</w:t>
             </w:r>
             <w:r>
               <w:rPr>
@@ -4249,7 +4249,7 @@
                 <w:color w:val="131B2E"/>
                 <w:sz w:val="15"/>
               </w:rPr>
-              <w:t xml:space="preserve"> por la vía de suscripción. Sube al primer puesto al corregirse su capacidad, que no era de 21 artículos al año sino de 35-38. Su puntaje es el más frágil del conjunto: 0 de 6 datos verificados en la revista.</w:t>
+              <w:t xml:space="preserve"> por la vía de suscripción. Su tiempo de revisión está sin verificar.</w:t>
             </w:r>
           </w:p>
         </w:tc>
@@ -4784,7 +4784,7 @@
           <w:color w:val="131B2E"/>
           <w:sz w:val="17"/>
         </w:rPr>
-        <w:t>, por delante de IJIT (82.0), y es la única candidata que supera a BEEI (87.5) en puntuación absoluta.</w:t>
+        <w:t>, por delante de ISJ (81.0), y es la única candidata que supera a BEEI (87.5) en puntuación absoluta.</w:t>
       </w:r>
     </w:p>
     <w:p>

</xml_diff>

<commit_message>
feat(articulo): exige acceso abierto y fija los planes A-D del autor
Tercer filtro de entrada: acceso abierto medido con OpenAlex sobre todo lo
publicado desde 2025-01-01 mas descarga real de PDF sin sesion.

Descartadas: IJIT (90,8% cerrado), ISJ (88,1%), ICS (78,2%). Las tres eran
gratuitas por la via de suscripcion; gratis para el autor y abierto para el
lector son cosas distintas.

Planes fijados por el autor, no por puntaje: A IJIES - B ISI - C BEEI - D IJSSE.
BEEI e IJSSE reingresan pese a figurar en la lista de control institucional,
pendiente de confirmar con la coordinacion si inhabilita o solo registra.

Declarado: IJIES es acceso abierto bronce sin licencia, el mas debil de los
cuatro planes; BEEI es el mas solido (diamante, CC BY-SA, 0/682 cerrados).
DOAJ no pudo consultarse (502/403).

Co-Authored-By: Claude Opus 5 <noreply@anthropic.com>
Claude-Session: https://claude.ai/code/session_0118CSEqQvxD2LbN5hkqoZC6
</commit_message>
<xml_diff>
--- a/docs/entregables/09-matriz-revistas/Matriz-decision-revistas.docx
+++ b/docs/entregables/09-matriz-revistas/Matriz-decision-revistas.docx
@@ -3742,7 +3742,7 @@
           <w:color w:val="1F4E79"/>
           <w:sz w:val="23"/>
         </w:rPr>
-        <w:t>5 · Plan A, B y C</w:t>
+        <w:t>5 · Filtro de acceso abierto</w:t>
       </w:r>
     </w:p>
     <w:p>
@@ -3755,27 +3755,9 @@
           <w:b w:val="0"/>
           <w:i w:val="0"/>
           <w:color w:val="131B2E"/>
-          <w:sz w:val="16"/>
+          <w:sz w:val="17"/>
         </w:rPr>
-        <w:t xml:space="preserve">Los planes se asignan </w:t>
-      </w:r>
-      <w:r>
-        <w:rPr>
-          <w:b/>
-          <w:i w:val="0"/>
-          <w:color w:val="131B2E"/>
-          <w:sz w:val="16"/>
-        </w:rPr>
-        <w:t>solo entre las candidatas disponibles</w:t>
-      </w:r>
-      <w:r>
-        <w:rPr>
-          <w:b w:val="0"/>
-          <w:i w:val="0"/>
-          <w:color w:val="131B2E"/>
-          <w:sz w:val="16"/>
-        </w:rPr>
-        <w:t>. Los puntajes de las tres ya registradas se conservan a la vista para que la comparación siga completa.</w:t>
+        <w:t>Requisito del autor, 01/09/2026: si no es de acceso abierto, se descarta. Tercer filtro de entrada — no toca ningún puntaje, decide quién sigue en carrera. Medido con OpenAlex sobre todo lo publicado desde el 1 de enero de 2025, más una descarga real de PDF sin sesión iniciada.</w:t>
       </w:r>
     </w:p>
     <w:tbl>
@@ -3794,15 +3776,16 @@
         </w:tblBorders>
       </w:tblPr>
       <w:tblGrid>
-        <w:gridCol w:w="2606"/>
-        <w:gridCol w:w="2606"/>
-        <w:gridCol w:w="2606"/>
-        <w:gridCol w:w="2606"/>
+        <w:gridCol w:w="2085"/>
+        <w:gridCol w:w="2085"/>
+        <w:gridCol w:w="2085"/>
+        <w:gridCol w:w="2085"/>
+        <w:gridCol w:w="2085"/>
       </w:tblGrid>
       <w:tr>
         <w:tc>
           <w:tcPr>
-            <w:tcW w:type="dxa" w:w="1020"/>
+            <w:tcW w:type="dxa" w:w="1361"/>
             <w:shd w:val="clear" w:fill="1F4E79"/>
           </w:tcPr>
           <w:p>
@@ -3813,6 +3796,7 @@
                 <w:color w:val="FFFFFF"/>
                 <w:sz w:val="16"/>
               </w:rPr>
+              <w:t>Revista</w:t>
             </w:r>
           </w:p>
         </w:tc>
@@ -3829,13 +3813,13 @@
                 <w:color w:val="FFFFFF"/>
                 <w:sz w:val="16"/>
               </w:rPr>
-              <w:t>Revista</w:t>
-            </w:r>
-          </w:p>
-        </w:tc>
-        <w:tc>
-          <w:tcPr>
-            <w:tcW w:type="dxa" w:w="1020"/>
+              <w:t>Estado</w:t>
+            </w:r>
+          </w:p>
+        </w:tc>
+        <w:tc>
+          <w:tcPr>
+            <w:tcW w:type="dxa" w:w="1928"/>
             <w:shd w:val="clear" w:fill="1F4E79"/>
           </w:tcPr>
           <w:p>
@@ -3846,13 +3830,13 @@
                 <w:color w:val="FFFFFF"/>
                 <w:sz w:val="16"/>
               </w:rPr>
-              <w:t>Puntaje</w:t>
-            </w:r>
-          </w:p>
-        </w:tc>
-        <w:tc>
-          <w:tcPr>
-            <w:tcW w:type="dxa" w:w="6690"/>
+              <w:t>Cerrados</w:t>
+            </w:r>
+          </w:p>
+        </w:tc>
+        <w:tc>
+          <w:tcPr>
+            <w:tcW w:type="dxa" w:w="1701"/>
             <w:shd w:val="clear" w:fill="1F4E79"/>
           </w:tcPr>
           <w:p>
@@ -3863,7 +3847,24 @@
                 <w:color w:val="FFFFFF"/>
                 <w:sz w:val="16"/>
               </w:rPr>
-              <w:t>Por qué en esa posición</w:t>
+              <w:t>Licencia</w:t>
+            </w:r>
+          </w:p>
+        </w:tc>
+        <w:tc>
+          <w:tcPr>
+            <w:tcW w:type="dxa" w:w="3742"/>
+            <w:shd w:val="clear" w:fill="1F4E79"/>
+          </w:tcPr>
+          <w:p>
+            <w:r/>
+            <w:r>
+              <w:rPr>
+                <w:b/>
+                <w:color w:val="FFFFFF"/>
+                <w:sz w:val="16"/>
+              </w:rPr>
+              <w:t>Veredicto</w:t>
             </w:r>
           </w:p>
         </w:tc>
@@ -3871,7 +3872,7 @@
       <w:tr>
         <w:tc>
           <w:tcPr>
-            <w:tcW w:type="dxa" w:w="1020"/>
+            <w:tcW w:type="dxa" w:w="1361"/>
             <w:shd w:val="clear" w:fill="E0F3E6"/>
           </w:tcPr>
           <w:p>
@@ -3885,7 +3886,7 @@
                 <w:color w:val="131B2E"/>
                 <w:sz w:val="15"/>
               </w:rPr>
-              <w:t>Plan A</w:t>
+              <w:t>BEEI</w:t>
             </w:r>
           </w:p>
         </w:tc>
@@ -3905,13 +3906,13 @@
                 <w:color w:val="131B2E"/>
                 <w:sz w:val="15"/>
               </w:rPr>
-              <w:t>IJIES</w:t>
-            </w:r>
-          </w:p>
-        </w:tc>
-        <w:tc>
-          <w:tcPr>
-            <w:tcW w:type="dxa" w:w="1020"/>
+              <w:t>Diamante</w:t>
+            </w:r>
+          </w:p>
+        </w:tc>
+        <w:tc>
+          <w:tcPr>
+            <w:tcW w:type="dxa" w:w="1928"/>
             <w:shd w:val="clear" w:fill="E0F3E6"/>
           </w:tcPr>
           <w:p>
@@ -3925,13 +3926,13 @@
                 <w:color w:val="131B2E"/>
                 <w:sz w:val="15"/>
               </w:rPr>
-              <w:t>87.5</w:t>
-            </w:r>
-          </w:p>
-        </w:tc>
-        <w:tc>
-          <w:tcPr>
-            <w:tcW w:type="dxa" w:w="6690"/>
+              <w:t>0/682 (0.0 %)</w:t>
+            </w:r>
+          </w:p>
+        </w:tc>
+        <w:tc>
+          <w:tcPr>
+            <w:tcW w:type="dxa" w:w="1701"/>
             <w:shd w:val="clear" w:fill="E0F3E6"/>
           </w:tcPr>
           <w:p>
@@ -3945,22 +3946,27 @@
                 <w:color w:val="131B2E"/>
                 <w:sz w:val="15"/>
               </w:rPr>
-            </w:r>
-            <w:r>
-              <w:rPr>
-                <w:b/>
-                <w:color w:val="131B2E"/>
-                <w:sz w:val="15"/>
-              </w:rPr>
-              <w:t>El mayor volumen de las disponibles</w:t>
-            </w:r>
+              <w:t>CC BY-SA</w:t>
+            </w:r>
+          </w:p>
+        </w:tc>
+        <w:tc>
+          <w:tcPr>
+            <w:tcW w:type="dxa" w:w="3742"/>
+            <w:shd w:val="clear" w:fill="E0F3E6"/>
+          </w:tcPr>
+          <w:p>
+            <w:pPr>
+              <w:spacing w:after="20"/>
+            </w:pPr>
+            <w:r/>
             <w:r>
               <w:rPr>
                 <w:b w:val="0"/>
                 <w:color w:val="131B2E"/>
                 <w:sz w:val="15"/>
               </w:rPr>
-              <w:t xml:space="preserve"> —481, 556 y 467 artículos en 2024, 2025 y 2026— con el APC más bajo del conjunto y publicación 2 meses después de aceptar. Con reserva: hay que confirmar que sigue activa en Scopus.</w:t>
+              <w:t>Pasa</w:t>
             </w:r>
           </w:p>
         </w:tc>
@@ -3968,7 +3974,8 @@
       <w:tr>
         <w:tc>
           <w:tcPr>
-            <w:tcW w:type="dxa" w:w="1020"/>
+            <w:tcW w:type="dxa" w:w="1361"/>
+            <w:shd w:val="clear" w:fill="E0F3E6"/>
           </w:tcPr>
           <w:p>
             <w:pPr>
@@ -3981,13 +3988,14 @@
                 <w:color w:val="131B2E"/>
                 <w:sz w:val="15"/>
               </w:rPr>
-              <w:t>—</w:t>
+              <w:t>IJACSA</w:t>
             </w:r>
           </w:p>
         </w:tc>
         <w:tc>
           <w:tcPr>
             <w:tcW w:type="dxa" w:w="1361"/>
+            <w:shd w:val="clear" w:fill="E0F3E6"/>
           </w:tcPr>
           <w:p>
             <w:pPr>
@@ -4000,13 +4008,14 @@
                 <w:color w:val="131B2E"/>
                 <w:sz w:val="15"/>
               </w:rPr>
-              <w:t>BEEI</w:t>
-            </w:r>
-          </w:p>
-        </w:tc>
-        <w:tc>
-          <w:tcPr>
-            <w:tcW w:type="dxa" w:w="1020"/>
+              <w:t>Diamante</w:t>
+            </w:r>
+          </w:p>
+        </w:tc>
+        <w:tc>
+          <w:tcPr>
+            <w:tcW w:type="dxa" w:w="1928"/>
+            <w:shd w:val="clear" w:fill="E0F3E6"/>
           </w:tcPr>
           <w:p>
             <w:pPr>
@@ -4019,13 +4028,14 @@
                 <w:color w:val="131B2E"/>
                 <w:sz w:val="15"/>
               </w:rPr>
-              <w:t>84.0</w:t>
-            </w:r>
-          </w:p>
-        </w:tc>
-        <w:tc>
-          <w:tcPr>
-            <w:tcW w:type="dxa" w:w="6690"/>
+              <w:t>0/2156 (0.0 %)</w:t>
+            </w:r>
+          </w:p>
+        </w:tc>
+        <w:tc>
+          <w:tcPr>
+            <w:tcW w:type="dxa" w:w="1701"/>
+            <w:shd w:val="clear" w:fill="E0F3E6"/>
           </w:tcPr>
           <w:p>
             <w:pPr>
@@ -4038,23 +4048,27 @@
                 <w:color w:val="131B2E"/>
                 <w:sz w:val="15"/>
               </w:rPr>
-              <w:t xml:space="preserve">Mejor puntaje absoluto, pero </w:t>
-            </w:r>
-            <w:r>
-              <w:rPr>
-                <w:b/>
-                <w:color w:val="131B2E"/>
-                <w:sz w:val="15"/>
-              </w:rPr>
-              <w:t>ya registrada</w:t>
-            </w:r>
+              <w:t>—</w:t>
+            </w:r>
+          </w:p>
+        </w:tc>
+        <w:tc>
+          <w:tcPr>
+            <w:tcW w:type="dxa" w:w="3742"/>
+            <w:shd w:val="clear" w:fill="E0F3E6"/>
+          </w:tcPr>
+          <w:p>
+            <w:pPr>
+              <w:spacing w:after="20"/>
+            </w:pPr>
+            <w:r/>
             <w:r>
               <w:rPr>
                 <w:b w:val="0"/>
                 <w:color w:val="131B2E"/>
                 <w:sz w:val="15"/>
               </w:rPr>
-              <w:t xml:space="preserve"> en la lista de control.</w:t>
+              <w:t>Pasa</w:t>
             </w:r>
           </w:p>
         </w:tc>
@@ -4062,7 +4076,7 @@
       <w:tr>
         <w:tc>
           <w:tcPr>
-            <w:tcW w:type="dxa" w:w="1020"/>
+            <w:tcW w:type="dxa" w:w="1361"/>
             <w:shd w:val="clear" w:fill="E0F3E6"/>
           </w:tcPr>
           <w:p>
@@ -4076,7 +4090,7 @@
                 <w:color w:val="131B2E"/>
                 <w:sz w:val="15"/>
               </w:rPr>
-              <w:t>Plan B</w:t>
+              <w:t>CIT</w:t>
             </w:r>
           </w:p>
         </w:tc>
@@ -4096,13 +4110,13 @@
                 <w:color w:val="131B2E"/>
                 <w:sz w:val="15"/>
               </w:rPr>
-              <w:t>ISJ</w:t>
-            </w:r>
-          </w:p>
-        </w:tc>
-        <w:tc>
-          <w:tcPr>
-            <w:tcW w:type="dxa" w:w="1020"/>
+              <w:t>Diamante</w:t>
+            </w:r>
+          </w:p>
+        </w:tc>
+        <w:tc>
+          <w:tcPr>
+            <w:tcW w:type="dxa" w:w="1928"/>
             <w:shd w:val="clear" w:fill="E0F3E6"/>
           </w:tcPr>
           <w:p>
@@ -4116,13 +4130,13 @@
                 <w:color w:val="131B2E"/>
                 <w:sz w:val="15"/>
               </w:rPr>
-              <w:t>81.0</w:t>
-            </w:r>
-          </w:p>
-        </w:tc>
-        <w:tc>
-          <w:tcPr>
-            <w:tcW w:type="dxa" w:w="6690"/>
+              <w:t>0/58 (0.0 %)</w:t>
+            </w:r>
+          </w:p>
+        </w:tc>
+        <w:tc>
+          <w:tcPr>
+            <w:tcW w:type="dxa" w:w="1701"/>
             <w:shd w:val="clear" w:fill="E0F3E6"/>
           </w:tcPr>
           <w:p>
@@ -4136,22 +4150,27 @@
                 <w:color w:val="131B2E"/>
                 <w:sz w:val="15"/>
               </w:rPr>
-            </w:r>
-            <w:r>
-              <w:rPr>
-                <w:b/>
-                <w:color w:val="131B2E"/>
-                <w:sz w:val="15"/>
-              </w:rPr>
-              <w:t>No exige APC</w:t>
-            </w:r>
+              <w:t>CC BY</w:t>
+            </w:r>
+          </w:p>
+        </w:tc>
+        <w:tc>
+          <w:tcPr>
+            <w:tcW w:type="dxa" w:w="3742"/>
+            <w:shd w:val="clear" w:fill="E0F3E6"/>
+          </w:tcPr>
+          <w:p>
+            <w:pPr>
+              <w:spacing w:after="20"/>
+            </w:pPr>
+            <w:r/>
             <w:r>
               <w:rPr>
                 <w:b w:val="0"/>
                 <w:color w:val="131B2E"/>
                 <w:sz w:val="15"/>
               </w:rPr>
-              <w:t xml:space="preserve"> por la vía de suscripción. Sube al primer puesto al corregirse su capacidad, que no era de 21 artículos al año sino de 35-38. Su puntaje es el más frágil del conjunto: 0 de 6 datos verificados en la revista.</w:t>
+              <w:t>Pasa</w:t>
             </w:r>
           </w:p>
         </w:tc>
@@ -4159,7 +4178,7 @@
       <w:tr>
         <w:tc>
           <w:tcPr>
-            <w:tcW w:type="dxa" w:w="1020"/>
+            <w:tcW w:type="dxa" w:w="1361"/>
             <w:shd w:val="clear" w:fill="E0F3E6"/>
           </w:tcPr>
           <w:p>
@@ -4173,7 +4192,7 @@
                 <w:color w:val="131B2E"/>
                 <w:sz w:val="15"/>
               </w:rPr>
-              <w:t>Plan C</w:t>
+              <w:t>IJIES</w:t>
             </w:r>
           </w:p>
         </w:tc>
@@ -4193,13 +4212,13 @@
                 <w:color w:val="131B2E"/>
                 <w:sz w:val="15"/>
               </w:rPr>
-              <w:t>IJIT</w:t>
-            </w:r>
-          </w:p>
-        </w:tc>
-        <w:tc>
-          <w:tcPr>
-            <w:tcW w:type="dxa" w:w="1020"/>
+              <w:t>Bronce</w:t>
+            </w:r>
+          </w:p>
+        </w:tc>
+        <w:tc>
+          <w:tcPr>
+            <w:tcW w:type="dxa" w:w="1928"/>
             <w:shd w:val="clear" w:fill="E0F3E6"/>
           </w:tcPr>
           <w:p>
@@ -4213,13 +4232,13 @@
                 <w:color w:val="131B2E"/>
                 <w:sz w:val="15"/>
               </w:rPr>
-              <w:t>79.5</w:t>
-            </w:r>
-          </w:p>
-        </w:tc>
-        <w:tc>
-          <w:tcPr>
-            <w:tcW w:type="dxa" w:w="6690"/>
+              <w:t>75/1098 (6.8 %)</w:t>
+            </w:r>
+          </w:p>
+        </w:tc>
+        <w:tc>
+          <w:tcPr>
+            <w:tcW w:type="dxa" w:w="1701"/>
             <w:shd w:val="clear" w:fill="E0F3E6"/>
           </w:tcPr>
           <w:p>
@@ -4233,23 +4252,27 @@
                 <w:color w:val="131B2E"/>
                 <w:sz w:val="15"/>
               </w:rPr>
-              <w:t xml:space="preserve">Volumen comparable con respaldo de Springer, que elimina el riesgo de descontinuación, y </w:t>
-            </w:r>
-            <w:r>
-              <w:rPr>
-                <w:b/>
-                <w:color w:val="131B2E"/>
-                <w:sz w:val="15"/>
-              </w:rPr>
-              <w:t>sin APC</w:t>
-            </w:r>
+              <w:t>ninguna</w:t>
+            </w:r>
+          </w:p>
+        </w:tc>
+        <w:tc>
+          <w:tcPr>
+            <w:tcW w:type="dxa" w:w="3742"/>
+            <w:shd w:val="clear" w:fill="E0F3E6"/>
+          </w:tcPr>
+          <w:p>
+            <w:pPr>
+              <w:spacing w:after="20"/>
+            </w:pPr>
+            <w:r/>
             <w:r>
               <w:rPr>
                 <w:b w:val="0"/>
                 <w:color w:val="131B2E"/>
                 <w:sz w:val="15"/>
               </w:rPr>
-              <w:t xml:space="preserve"> por la vía de suscripción. Su tiempo de revisión está sin verificar.</w:t>
+              <w:t>Pasa</w:t>
             </w:r>
           </w:p>
         </w:tc>
@@ -4257,8 +4280,8 @@
       <w:tr>
         <w:tc>
           <w:tcPr>
-            <w:tcW w:type="dxa" w:w="1020"/>
-            <w:shd w:val="clear" w:fill="EEF3FA"/>
+            <w:tcW w:type="dxa" w:w="1361"/>
+            <w:shd w:val="clear" w:fill="E0F3E6"/>
           </w:tcPr>
           <w:p>
             <w:pPr>
@@ -4271,14 +4294,14 @@
                 <w:color w:val="131B2E"/>
                 <w:sz w:val="15"/>
               </w:rPr>
-              <w:t>—</w:t>
+              <w:t>IJSSE</w:t>
             </w:r>
           </w:p>
         </w:tc>
         <w:tc>
           <w:tcPr>
             <w:tcW w:type="dxa" w:w="1361"/>
-            <w:shd w:val="clear" w:fill="EEF3FA"/>
+            <w:shd w:val="clear" w:fill="E0F3E6"/>
           </w:tcPr>
           <w:p>
             <w:pPr>
@@ -4291,14 +4314,14 @@
                 <w:color w:val="131B2E"/>
                 <w:sz w:val="15"/>
               </w:rPr>
-              <w:t>CIT</w:t>
-            </w:r>
-          </w:p>
-        </w:tc>
-        <w:tc>
-          <w:tcPr>
-            <w:tcW w:type="dxa" w:w="1020"/>
-            <w:shd w:val="clear" w:fill="EEF3FA"/>
+              <w:t>Híbrido</w:t>
+            </w:r>
+          </w:p>
+        </w:tc>
+        <w:tc>
+          <w:tcPr>
+            <w:tcW w:type="dxa" w:w="1928"/>
+            <w:shd w:val="clear" w:fill="E0F3E6"/>
           </w:tcPr>
           <w:p>
             <w:pPr>
@@ -4311,14 +4334,14 @@
                 <w:color w:val="131B2E"/>
                 <w:sz w:val="15"/>
               </w:rPr>
-              <w:t>77.5</w:t>
-            </w:r>
-          </w:p>
-        </w:tc>
-        <w:tc>
-          <w:tcPr>
-            <w:tcW w:type="dxa" w:w="6690"/>
-            <w:shd w:val="clear" w:fill="EEF3FA"/>
+              <w:t>34/400 (8.5 %)</w:t>
+            </w:r>
+          </w:p>
+        </w:tc>
+        <w:tc>
+          <w:tcPr>
+            <w:tcW w:type="dxa" w:w="1701"/>
+            <w:shd w:val="clear" w:fill="E0F3E6"/>
           </w:tcPr>
           <w:p>
             <w:pPr>
@@ -4331,15 +4354,14 @@
                 <w:color w:val="131B2E"/>
                 <w:sz w:val="15"/>
               </w:rPr>
-              <w:t>Puntúa menos, pero es la única con los seis datos verificados en la propia revista, la única con Q2 y factor de impacto de Web of Science confirmados, y la única que publica detección y mitigación. Su desventaja está declarada: 3-6 meses.</w:t>
-            </w:r>
-          </w:p>
-        </w:tc>
-      </w:tr>
-      <w:tr>
-        <w:tc>
-          <w:tcPr>
-            <w:tcW w:type="dxa" w:w="1020"/>
+              <w:t>CC BY</w:t>
+            </w:r>
+          </w:p>
+        </w:tc>
+        <w:tc>
+          <w:tcPr>
+            <w:tcW w:type="dxa" w:w="3742"/>
+            <w:shd w:val="clear" w:fill="E0F3E6"/>
           </w:tcPr>
           <w:p>
             <w:pPr>
@@ -4352,13 +4374,16 @@
                 <w:color w:val="131B2E"/>
                 <w:sz w:val="15"/>
               </w:rPr>
-              <w:t>—</w:t>
-            </w:r>
-          </w:p>
-        </w:tc>
+              <w:t>Pasa</w:t>
+            </w:r>
+          </w:p>
+        </w:tc>
+      </w:tr>
+      <w:tr>
         <w:tc>
           <w:tcPr>
             <w:tcW w:type="dxa" w:w="1361"/>
+            <w:shd w:val="clear" w:fill="E0F3E6"/>
           </w:tcPr>
           <w:p>
             <w:pPr>
@@ -4371,13 +4396,14 @@
                 <w:color w:val="131B2E"/>
                 <w:sz w:val="15"/>
               </w:rPr>
-              <w:t>IJSSE</w:t>
-            </w:r>
-          </w:p>
-        </w:tc>
-        <w:tc>
-          <w:tcPr>
-            <w:tcW w:type="dxa" w:w="1020"/>
+              <w:t>ISI</w:t>
+            </w:r>
+          </w:p>
+        </w:tc>
+        <w:tc>
+          <w:tcPr>
+            <w:tcW w:type="dxa" w:w="1361"/>
+            <w:shd w:val="clear" w:fill="E0F3E6"/>
           </w:tcPr>
           <w:p>
             <w:pPr>
@@ -4390,13 +4416,14 @@
                 <w:color w:val="131B2E"/>
                 <w:sz w:val="15"/>
               </w:rPr>
-              <w:t>75.5</w:t>
-            </w:r>
-          </w:p>
-        </w:tc>
-        <w:tc>
-          <w:tcPr>
-            <w:tcW w:type="dxa" w:w="6690"/>
+              <w:t>Híbrido</w:t>
+            </w:r>
+          </w:p>
+        </w:tc>
+        <w:tc>
+          <w:tcPr>
+            <w:tcW w:type="dxa" w:w="1928"/>
+            <w:shd w:val="clear" w:fill="E0F3E6"/>
           </w:tcPr>
           <w:p>
             <w:pPr>
@@ -4409,32 +4436,34 @@
                 <w:color w:val="131B2E"/>
                 <w:sz w:val="15"/>
               </w:rPr>
-              <w:t xml:space="preserve">Encaje idéntico al de BEEI y ciclo rápido, pero menor visibilidad y APC del doble. </w:t>
-            </w:r>
-            <w:r>
-              <w:rPr>
-                <w:b/>
-                <w:color w:val="131B2E"/>
-                <w:sz w:val="15"/>
-              </w:rPr>
-              <w:t>Ya registrada</w:t>
-            </w:r>
+              <w:t>81/521 (15.5 %)</w:t>
+            </w:r>
+          </w:p>
+        </w:tc>
+        <w:tc>
+          <w:tcPr>
+            <w:tcW w:type="dxa" w:w="1701"/>
+            <w:shd w:val="clear" w:fill="E0F3E6"/>
+          </w:tcPr>
+          <w:p>
+            <w:pPr>
+              <w:spacing w:after="20"/>
+            </w:pPr>
+            <w:r/>
             <w:r>
               <w:rPr>
                 <w:b w:val="0"/>
                 <w:color w:val="131B2E"/>
                 <w:sz w:val="15"/>
               </w:rPr>
-              <w:t xml:space="preserve"> en la lista de control.</w:t>
-            </w:r>
-          </w:p>
-        </w:tc>
-      </w:tr>
-      <w:tr>
-        <w:tc>
-          <w:tcPr>
-            <w:tcW w:type="dxa" w:w="1020"/>
-            <w:shd w:val="clear" w:fill="EEF3FA"/>
+              <w:t>CC BY</w:t>
+            </w:r>
+          </w:p>
+        </w:tc>
+        <w:tc>
+          <w:tcPr>
+            <w:tcW w:type="dxa" w:w="3742"/>
+            <w:shd w:val="clear" w:fill="E0F3E6"/>
           </w:tcPr>
           <w:p>
             <w:pPr>
@@ -4447,10 +4476,12 @@
                 <w:color w:val="131B2E"/>
                 <w:sz w:val="15"/>
               </w:rPr>
-              <w:t>—</w:t>
-            </w:r>
-          </w:p>
-        </w:tc>
+              <w:t>Pasa</w:t>
+            </w:r>
+          </w:p>
+        </w:tc>
+      </w:tr>
+      <w:tr>
         <w:tc>
           <w:tcPr>
             <w:tcW w:type="dxa" w:w="1361"/>
@@ -4473,7 +4504,7 @@
         </w:tc>
         <w:tc>
           <w:tcPr>
-            <w:tcW w:type="dxa" w:w="1020"/>
+            <w:tcW w:type="dxa" w:w="1361"/>
             <w:shd w:val="clear" w:fill="EEF3FA"/>
           </w:tcPr>
           <w:p>
@@ -4487,13 +4518,13 @@
                 <w:color w:val="131B2E"/>
                 <w:sz w:val="15"/>
               </w:rPr>
-              <w:t>73.5</w:t>
-            </w:r>
-          </w:p>
-        </w:tc>
-        <w:tc>
-          <w:tcPr>
-            <w:tcW w:type="dxa" w:w="6690"/>
+              <w:t>Cerrado</w:t>
+            </w:r>
+          </w:p>
+        </w:tc>
+        <w:tc>
+          <w:tcPr>
+            <w:tcW w:type="dxa" w:w="1928"/>
             <w:shd w:val="clear" w:fill="EEF3FA"/>
           </w:tcPr>
           <w:p>
@@ -4507,15 +4538,14 @@
                 <w:color w:val="131B2E"/>
                 <w:sz w:val="15"/>
               </w:rPr>
-              <w:t>El mayor prestigio (h-index 60), pero su centro editorial se inclina a factores humanos y sus datos siguen sin verificar.</w:t>
-            </w:r>
-          </w:p>
-        </w:tc>
-      </w:tr>
-      <w:tr>
-        <w:tc>
-          <w:tcPr>
-            <w:tcW w:type="dxa" w:w="1020"/>
+              <w:t>79/101 (78.2 %)</w:t>
+            </w:r>
+          </w:p>
+        </w:tc>
+        <w:tc>
+          <w:tcPr>
+            <w:tcW w:type="dxa" w:w="1701"/>
+            <w:shd w:val="clear" w:fill="EEF3FA"/>
           </w:tcPr>
           <w:p>
             <w:pPr>
@@ -4534,7 +4564,8 @@
         </w:tc>
         <w:tc>
           <w:tcPr>
-            <w:tcW w:type="dxa" w:w="1361"/>
+            <w:tcW w:type="dxa" w:w="3742"/>
+            <w:shd w:val="clear" w:fill="EEF3FA"/>
           </w:tcPr>
           <w:p>
             <w:pPr>
@@ -4547,13 +4578,15 @@
                 <w:color w:val="131B2E"/>
                 <w:sz w:val="15"/>
               </w:rPr>
-              <w:t>IJACSA</w:t>
-            </w:r>
-          </w:p>
-        </w:tc>
-        <w:tc>
-          <w:tcPr>
-            <w:tcW w:type="dxa" w:w="1020"/>
+              <w:t>DESCARTADA</w:t>
+            </w:r>
+          </w:p>
+        </w:tc>
+      </w:tr>
+      <w:tr>
+        <w:tc>
+          <w:tcPr>
+            <w:tcW w:type="dxa" w:w="1361"/>
           </w:tcPr>
           <w:p>
             <w:pPr>
@@ -4566,13 +4599,13 @@
                 <w:color w:val="131B2E"/>
                 <w:sz w:val="15"/>
               </w:rPr>
-              <w:t>69.5</w:t>
-            </w:r>
-          </w:p>
-        </w:tc>
-        <w:tc>
-          <w:tcPr>
-            <w:tcW w:type="dxa" w:w="6690"/>
+              <w:t>ISJ</w:t>
+            </w:r>
+          </w:p>
+        </w:tc>
+        <w:tc>
+          <w:tcPr>
+            <w:tcW w:type="dxa" w:w="1361"/>
           </w:tcPr>
           <w:p>
             <w:pPr>
@@ -4585,32 +4618,32 @@
                 <w:color w:val="131B2E"/>
                 <w:sz w:val="15"/>
               </w:rPr>
-              <w:t xml:space="preserve">La más rápida, pero de alcance genérico, con el APC más alto y </w:t>
-            </w:r>
-            <w:r>
-              <w:rPr>
-                <w:b/>
-                <w:color w:val="131B2E"/>
-                <w:sz w:val="15"/>
-              </w:rPr>
-              <w:t>ya registrada</w:t>
-            </w:r>
+              <w:t>Cerrado</w:t>
+            </w:r>
+          </w:p>
+        </w:tc>
+        <w:tc>
+          <w:tcPr>
+            <w:tcW w:type="dxa" w:w="1928"/>
+          </w:tcPr>
+          <w:p>
+            <w:pPr>
+              <w:spacing w:after="20"/>
+            </w:pPr>
+            <w:r/>
             <w:r>
               <w:rPr>
                 <w:b w:val="0"/>
                 <w:color w:val="131B2E"/>
                 <w:sz w:val="15"/>
               </w:rPr>
-              <w:t xml:space="preserve"> en la lista de control.</w:t>
-            </w:r>
-          </w:p>
-        </w:tc>
-      </w:tr>
-      <w:tr>
-        <w:tc>
-          <w:tcPr>
-            <w:tcW w:type="dxa" w:w="1020"/>
-            <w:shd w:val="clear" w:fill="EEF3FA"/>
+              <w:t>89/101 (88.1 %)</w:t>
+            </w:r>
+          </w:p>
+        </w:tc>
+        <w:tc>
+          <w:tcPr>
+            <w:tcW w:type="dxa" w:w="1701"/>
           </w:tcPr>
           <w:p>
             <w:pPr>
@@ -4629,8 +4662,7 @@
         </w:tc>
         <w:tc>
           <w:tcPr>
-            <w:tcW w:type="dxa" w:w="1361"/>
-            <w:shd w:val="clear" w:fill="EEF3FA"/>
+            <w:tcW w:type="dxa" w:w="3742"/>
           </w:tcPr>
           <w:p>
             <w:pPr>
@@ -4643,13 +4675,15 @@
                 <w:color w:val="131B2E"/>
                 <w:sz w:val="15"/>
               </w:rPr>
-              <w:t>ISI</w:t>
-            </w:r>
-          </w:p>
-        </w:tc>
-        <w:tc>
-          <w:tcPr>
-            <w:tcW w:type="dxa" w:w="1020"/>
+              <w:t>DESCARTADA</w:t>
+            </w:r>
+          </w:p>
+        </w:tc>
+      </w:tr>
+      <w:tr>
+        <w:tc>
+          <w:tcPr>
+            <w:tcW w:type="dxa" w:w="1361"/>
             <w:shd w:val="clear" w:fill="EEF3FA"/>
           </w:tcPr>
           <w:p>
@@ -4663,13 +4697,13 @@
                 <w:color w:val="131B2E"/>
                 <w:sz w:val="15"/>
               </w:rPr>
-              <w:t>69.0</w:t>
-            </w:r>
-          </w:p>
-        </w:tc>
-        <w:tc>
-          <w:tcPr>
-            <w:tcW w:type="dxa" w:w="6690"/>
+              <w:t>IJIT</w:t>
+            </w:r>
+          </w:p>
+        </w:tc>
+        <w:tc>
+          <w:tcPr>
+            <w:tcW w:type="dxa" w:w="1361"/>
             <w:shd w:val="clear" w:fill="EEF3FA"/>
           </w:tcPr>
           <w:p>
@@ -4683,23 +4717,67 @@
                 <w:color w:val="131B2E"/>
                 <w:sz w:val="15"/>
               </w:rPr>
-              <w:t xml:space="preserve">El único </w:t>
-            </w:r>
-            <w:r>
-              <w:rPr>
-                <w:b/>
-                <w:color w:val="131B2E"/>
-                <w:sz w:val="15"/>
-              </w:rPr>
-              <w:t>Q3</w:t>
-            </w:r>
+              <w:t>Cerrado</w:t>
+            </w:r>
+          </w:p>
+        </w:tc>
+        <w:tc>
+          <w:tcPr>
+            <w:tcW w:type="dxa" w:w="1928"/>
+            <w:shd w:val="clear" w:fill="EEF3FA"/>
+          </w:tcPr>
+          <w:p>
+            <w:pPr>
+              <w:spacing w:after="20"/>
+            </w:pPr>
+            <w:r/>
             <w:r>
               <w:rPr>
                 <w:b w:val="0"/>
                 <w:color w:val="131B2E"/>
                 <w:sz w:val="15"/>
               </w:rPr>
-              <w:t xml:space="preserve"> verificado de las disponibles, con 305 artículos al año y revisión de unos 2 meses. Su APC de USD 850 y su menor producción temática la dejan por debajo, pero cumple todos los criterios.</w:t>
+              <w:t>648/714 (90.8 %)</w:t>
+            </w:r>
+          </w:p>
+        </w:tc>
+        <w:tc>
+          <w:tcPr>
+            <w:tcW w:type="dxa" w:w="1701"/>
+            <w:shd w:val="clear" w:fill="EEF3FA"/>
+          </w:tcPr>
+          <w:p>
+            <w:pPr>
+              <w:spacing w:after="20"/>
+            </w:pPr>
+            <w:r/>
+            <w:r>
+              <w:rPr>
+                <w:b w:val="0"/>
+                <w:color w:val="131B2E"/>
+                <w:sz w:val="15"/>
+              </w:rPr>
+              <w:t>—</w:t>
+            </w:r>
+          </w:p>
+        </w:tc>
+        <w:tc>
+          <w:tcPr>
+            <w:tcW w:type="dxa" w:w="3742"/>
+            <w:shd w:val="clear" w:fill="EEF3FA"/>
+          </w:tcPr>
+          <w:p>
+            <w:pPr>
+              <w:spacing w:after="20"/>
+            </w:pPr>
+            <w:r/>
+            <w:r>
+              <w:rPr>
+                <w:b w:val="0"/>
+                <w:color w:val="131B2E"/>
+                <w:sz w:val="15"/>
+              </w:rPr>
+              <w:t>DESCARTADA</w:t>
             </w:r>
           </w:p>
         </w:tc>
@@ -4722,24 +4800,7 @@
           <w:color w:val="5B6B8C"/>
           <w:sz w:val="16"/>
         </w:rPr>
-      </w:r>
-      <w:r>
-        <w:rPr>
-          <w:b/>
-          <w:i/>
-          <w:color w:val="5B6B8C"/>
-          <w:sz w:val="16"/>
-        </w:rPr>
-        <w:t>El orden por debajo del Plan A es provisional.</w:t>
-      </w:r>
-      <w:r>
-        <w:rPr>
-          <w:b w:val="0"/>
-          <w:i/>
-          <w:color w:val="5B6B8C"/>
-          <w:sz w:val="16"/>
-        </w:rPr>
-        <w:t xml:space="preserve"> Solo BEEI, IJSSE y CIT tienen sus datos sensibles verificados en fuente primaria; ISJ, ICS e IJACSA se puntuaron con fuentes secundarias, y completar esa verificación puede reordenarlas. La distancia entre CIT (77,5) y ISJ (77,0) es de medio punto: menor que el margen que puede mover una sola verificación pendiente.</w:t>
+        <w:t>Caen tres: IJIT, ISJ e ICS. Las tres eran gratuitas para el autor por la vía de suscripción, y eso las hacía atractivas en el criterio de costo. El filtro deja a la vista lo que ese ahorro costaba: entre el 78 % y el 91 % de sus artículos no los puede leer nadie sin suscripción institucional. Gratis para el autor y abierto para el lector son cosas distintas.</w:t>
       </w:r>
     </w:p>
     <w:p>
@@ -4752,7 +4813,670 @@
           <w:color w:val="1F4E79"/>
           <w:sz w:val="23"/>
         </w:rPr>
-        <w:t>6 · Justificación</w:t>
+        <w:t>6 · Plan A, B, C y D</w:t>
+      </w:r>
+    </w:p>
+    <w:p>
+      <w:pPr>
+        <w:spacing w:after="80"/>
+        <w:jc w:val="both"/>
+      </w:pPr>
+      <w:r>
+        <w:rPr>
+          <w:b w:val="0"/>
+          <w:i w:val="0"/>
+          <w:color w:val="131B2E"/>
+          <w:sz w:val="16"/>
+        </w:rPr>
+        <w:t>Los cuatro planes los fijó el autor el 01/09/2026 entre las candidatas que superan los tres filtros. No se derivan del puntaje: se derivan de una decisión, y el puntaje queda al lado para que la diferencia se pueda discutir.</w:t>
+      </w:r>
+    </w:p>
+    <w:tbl>
+      <w:tblPr>
+        <w:tblW w:type="auto" w:w="0"/>
+        <w:jc w:val="center"/>
+        <w:tblLayout w:type="fixed"/>
+        <w:tblLook w:firstColumn="1" w:firstRow="1" w:lastColumn="0" w:lastRow="0" w:noHBand="0" w:noVBand="1" w:val="04A0"/>
+        <w:tblBorders>
+          <w:top w:val="single" w:sz="4" w:color="BFBFBF"/>
+          <w:left w:val="single" w:sz="4" w:color="BFBFBF"/>
+          <w:bottom w:val="single" w:sz="4" w:color="BFBFBF"/>
+          <w:right w:val="single" w:sz="4" w:color="BFBFBF"/>
+          <w:insideH w:val="single" w:sz="4" w:color="BFBFBF"/>
+          <w:insideV w:val="single" w:sz="4" w:color="BFBFBF"/>
+        </w:tblBorders>
+      </w:tblPr>
+      <w:tblGrid>
+        <w:gridCol w:w="1738"/>
+        <w:gridCol w:w="1738"/>
+        <w:gridCol w:w="1738"/>
+        <w:gridCol w:w="1738"/>
+        <w:gridCol w:w="1738"/>
+        <w:gridCol w:w="1738"/>
+      </w:tblGrid>
+      <w:tr>
+        <w:tc>
+          <w:tcPr>
+            <w:tcW w:type="dxa" w:w="1020"/>
+            <w:shd w:val="clear" w:fill="1F4E79"/>
+          </w:tcPr>
+          <w:p>
+            <w:r/>
+            <w:r>
+              <w:rPr>
+                <w:b/>
+                <w:color w:val="FFFFFF"/>
+                <w:sz w:val="16"/>
+              </w:rPr>
+            </w:r>
+          </w:p>
+        </w:tc>
+        <w:tc>
+          <w:tcPr>
+            <w:tcW w:type="dxa" w:w="1134"/>
+            <w:shd w:val="clear" w:fill="1F4E79"/>
+          </w:tcPr>
+          <w:p>
+            <w:r/>
+            <w:r>
+              <w:rPr>
+                <w:b/>
+                <w:color w:val="FFFFFF"/>
+                <w:sz w:val="16"/>
+              </w:rPr>
+              <w:t>Revista</w:t>
+            </w:r>
+          </w:p>
+        </w:tc>
+        <w:tc>
+          <w:tcPr>
+            <w:tcW w:type="dxa" w:w="964"/>
+            <w:shd w:val="clear" w:fill="1F4E79"/>
+          </w:tcPr>
+          <w:p>
+            <w:r/>
+            <w:r>
+              <w:rPr>
+                <w:b/>
+                <w:color w:val="FFFFFF"/>
+                <w:sz w:val="16"/>
+              </w:rPr>
+              <w:t>Puntaje</w:t>
+            </w:r>
+          </w:p>
+        </w:tc>
+        <w:tc>
+          <w:tcPr>
+            <w:tcW w:type="dxa" w:w="1134"/>
+            <w:shd w:val="clear" w:fill="1F4E79"/>
+          </w:tcPr>
+          <w:p>
+            <w:r/>
+            <w:r>
+              <w:rPr>
+                <w:b/>
+                <w:color w:val="FFFFFF"/>
+                <w:sz w:val="16"/>
+              </w:rPr>
+              <w:t>Acceso</w:t>
+            </w:r>
+          </w:p>
+        </w:tc>
+        <w:tc>
+          <w:tcPr>
+            <w:tcW w:type="dxa" w:w="1077"/>
+            <w:shd w:val="clear" w:fill="1F4E79"/>
+          </w:tcPr>
+          <w:p>
+            <w:r/>
+            <w:r>
+              <w:rPr>
+                <w:b/>
+                <w:color w:val="FFFFFF"/>
+                <w:sz w:val="16"/>
+              </w:rPr>
+              <w:t>En la lista</w:t>
+            </w:r>
+          </w:p>
+        </w:tc>
+        <w:tc>
+          <w:tcPr>
+            <w:tcW w:type="dxa" w:w="4762"/>
+            <w:shd w:val="clear" w:fill="1F4E79"/>
+          </w:tcPr>
+          <w:p>
+            <w:r/>
+            <w:r>
+              <w:rPr>
+                <w:b/>
+                <w:color w:val="FFFFFF"/>
+                <w:sz w:val="16"/>
+              </w:rPr>
+              <w:t>Por qué en esa posición</w:t>
+            </w:r>
+          </w:p>
+        </w:tc>
+      </w:tr>
+      <w:tr>
+        <w:tc>
+          <w:tcPr>
+            <w:tcW w:type="dxa" w:w="1020"/>
+            <w:shd w:val="clear" w:fill="E0F3E6"/>
+          </w:tcPr>
+          <w:p>
+            <w:pPr>
+              <w:spacing w:after="20"/>
+            </w:pPr>
+            <w:r/>
+            <w:r>
+              <w:rPr>
+                <w:b w:val="0"/>
+                <w:color w:val="131B2E"/>
+                <w:sz w:val="15"/>
+              </w:rPr>
+              <w:t>Plan A</w:t>
+            </w:r>
+          </w:p>
+        </w:tc>
+        <w:tc>
+          <w:tcPr>
+            <w:tcW w:type="dxa" w:w="1134"/>
+            <w:shd w:val="clear" w:fill="E0F3E6"/>
+          </w:tcPr>
+          <w:p>
+            <w:pPr>
+              <w:spacing w:after="20"/>
+            </w:pPr>
+            <w:r/>
+            <w:r>
+              <w:rPr>
+                <w:b w:val="0"/>
+                <w:color w:val="131B2E"/>
+                <w:sz w:val="15"/>
+              </w:rPr>
+              <w:t>IJIES</w:t>
+            </w:r>
+          </w:p>
+        </w:tc>
+        <w:tc>
+          <w:tcPr>
+            <w:tcW w:type="dxa" w:w="964"/>
+            <w:shd w:val="clear" w:fill="E0F3E6"/>
+          </w:tcPr>
+          <w:p>
+            <w:pPr>
+              <w:spacing w:after="20"/>
+            </w:pPr>
+            <w:r/>
+            <w:r>
+              <w:rPr>
+                <w:b w:val="0"/>
+                <w:color w:val="131B2E"/>
+                <w:sz w:val="15"/>
+              </w:rPr>
+              <w:t>87.5</w:t>
+            </w:r>
+          </w:p>
+        </w:tc>
+        <w:tc>
+          <w:tcPr>
+            <w:tcW w:type="dxa" w:w="1134"/>
+            <w:shd w:val="clear" w:fill="E0F3E6"/>
+          </w:tcPr>
+          <w:p>
+            <w:pPr>
+              <w:spacing w:after="20"/>
+            </w:pPr>
+            <w:r/>
+            <w:r>
+              <w:rPr>
+                <w:b w:val="0"/>
+                <w:color w:val="131B2E"/>
+                <w:sz w:val="15"/>
+              </w:rPr>
+              <w:t>Bronce</w:t>
+            </w:r>
+          </w:p>
+        </w:tc>
+        <w:tc>
+          <w:tcPr>
+            <w:tcW w:type="dxa" w:w="1077"/>
+            <w:shd w:val="clear" w:fill="E0F3E6"/>
+          </w:tcPr>
+          <w:p>
+            <w:pPr>
+              <w:spacing w:after="20"/>
+            </w:pPr>
+            <w:r/>
+            <w:r>
+              <w:rPr>
+                <w:b w:val="0"/>
+                <w:color w:val="131B2E"/>
+                <w:sz w:val="15"/>
+              </w:rPr>
+              <w:t>No</w:t>
+            </w:r>
+          </w:p>
+        </w:tc>
+        <w:tc>
+          <w:tcPr>
+            <w:tcW w:type="dxa" w:w="4762"/>
+            <w:shd w:val="clear" w:fill="E0F3E6"/>
+          </w:tcPr>
+          <w:p>
+            <w:pPr>
+              <w:spacing w:after="20"/>
+            </w:pPr>
+            <w:r/>
+            <w:r>
+              <w:rPr>
+                <w:b w:val="0"/>
+                <w:color w:val="131B2E"/>
+                <w:sz w:val="15"/>
+              </w:rPr>
+              <w:t>Mayor volumen del conjunto abierto (556 al año), APC más bajo (USD 300) y publicación 2 meses tras la aceptación. Reservas: confirmar Scopus, y su acceso abierto es bronce sin licencia, el más débil de los cuatro.</w:t>
+            </w:r>
+          </w:p>
+        </w:tc>
+      </w:tr>
+      <w:tr>
+        <w:tc>
+          <w:tcPr>
+            <w:tcW w:type="dxa" w:w="1020"/>
+            <w:shd w:val="clear" w:fill="E0F3E6"/>
+          </w:tcPr>
+          <w:p>
+            <w:pPr>
+              <w:spacing w:after="20"/>
+            </w:pPr>
+            <w:r/>
+            <w:r>
+              <w:rPr>
+                <w:b w:val="0"/>
+                <w:color w:val="131B2E"/>
+                <w:sz w:val="15"/>
+              </w:rPr>
+              <w:t>Plan B</w:t>
+            </w:r>
+          </w:p>
+        </w:tc>
+        <w:tc>
+          <w:tcPr>
+            <w:tcW w:type="dxa" w:w="1134"/>
+            <w:shd w:val="clear" w:fill="E0F3E6"/>
+          </w:tcPr>
+          <w:p>
+            <w:pPr>
+              <w:spacing w:after="20"/>
+            </w:pPr>
+            <w:r/>
+            <w:r>
+              <w:rPr>
+                <w:b w:val="0"/>
+                <w:color w:val="131B2E"/>
+                <w:sz w:val="15"/>
+              </w:rPr>
+              <w:t>ISI</w:t>
+            </w:r>
+          </w:p>
+        </w:tc>
+        <w:tc>
+          <w:tcPr>
+            <w:tcW w:type="dxa" w:w="964"/>
+            <w:shd w:val="clear" w:fill="E0F3E6"/>
+          </w:tcPr>
+          <w:p>
+            <w:pPr>
+              <w:spacing w:after="20"/>
+            </w:pPr>
+            <w:r/>
+            <w:r>
+              <w:rPr>
+                <w:b w:val="0"/>
+                <w:color w:val="131B2E"/>
+                <w:sz w:val="15"/>
+              </w:rPr>
+              <w:t>69.0</w:t>
+            </w:r>
+          </w:p>
+        </w:tc>
+        <w:tc>
+          <w:tcPr>
+            <w:tcW w:type="dxa" w:w="1134"/>
+            <w:shd w:val="clear" w:fill="E0F3E6"/>
+          </w:tcPr>
+          <w:p>
+            <w:pPr>
+              <w:spacing w:after="20"/>
+            </w:pPr>
+            <w:r/>
+            <w:r>
+              <w:rPr>
+                <w:b w:val="0"/>
+                <w:color w:val="131B2E"/>
+                <w:sz w:val="15"/>
+              </w:rPr>
+              <w:t>Híbrido</w:t>
+            </w:r>
+          </w:p>
+        </w:tc>
+        <w:tc>
+          <w:tcPr>
+            <w:tcW w:type="dxa" w:w="1077"/>
+            <w:shd w:val="clear" w:fill="E0F3E6"/>
+          </w:tcPr>
+          <w:p>
+            <w:pPr>
+              <w:spacing w:after="20"/>
+            </w:pPr>
+            <w:r/>
+            <w:r>
+              <w:rPr>
+                <w:b w:val="0"/>
+                <w:color w:val="131B2E"/>
+                <w:sz w:val="15"/>
+              </w:rPr>
+              <w:t>No</w:t>
+            </w:r>
+          </w:p>
+        </w:tc>
+        <w:tc>
+          <w:tcPr>
+            <w:tcW w:type="dxa" w:w="4762"/>
+            <w:shd w:val="clear" w:fill="E0F3E6"/>
+          </w:tcPr>
+          <w:p>
+            <w:pPr>
+              <w:spacing w:after="20"/>
+            </w:pPr>
+            <w:r/>
+            <w:r>
+              <w:rPr>
+                <w:b w:val="0"/>
+                <w:color w:val="131B2E"/>
+                <w:sz w:val="15"/>
+              </w:rPr>
+              <w:t>Único Q3 verificado, 305 artículos al año, licencia CC BY y PDF de descarga libre comprobada. En contra: APC de USD 850, 6-12 páginas y ningún plazo de revisión declarado.</w:t>
+            </w:r>
+          </w:p>
+        </w:tc>
+      </w:tr>
+      <w:tr>
+        <w:tc>
+          <w:tcPr>
+            <w:tcW w:type="dxa" w:w="1020"/>
+            <w:shd w:val="clear" w:fill="E0F3E6"/>
+          </w:tcPr>
+          <w:p>
+            <w:pPr>
+              <w:spacing w:after="20"/>
+            </w:pPr>
+            <w:r/>
+            <w:r>
+              <w:rPr>
+                <w:b w:val="0"/>
+                <w:color w:val="131B2E"/>
+                <w:sz w:val="15"/>
+              </w:rPr>
+              <w:t>Plan C</w:t>
+            </w:r>
+          </w:p>
+        </w:tc>
+        <w:tc>
+          <w:tcPr>
+            <w:tcW w:type="dxa" w:w="1134"/>
+            <w:shd w:val="clear" w:fill="E0F3E6"/>
+          </w:tcPr>
+          <w:p>
+            <w:pPr>
+              <w:spacing w:after="20"/>
+            </w:pPr>
+            <w:r/>
+            <w:r>
+              <w:rPr>
+                <w:b w:val="0"/>
+                <w:color w:val="131B2E"/>
+                <w:sz w:val="15"/>
+              </w:rPr>
+              <w:t>BEEI</w:t>
+            </w:r>
+          </w:p>
+        </w:tc>
+        <w:tc>
+          <w:tcPr>
+            <w:tcW w:type="dxa" w:w="964"/>
+            <w:shd w:val="clear" w:fill="E0F3E6"/>
+          </w:tcPr>
+          <w:p>
+            <w:pPr>
+              <w:spacing w:after="20"/>
+            </w:pPr>
+            <w:r/>
+            <w:r>
+              <w:rPr>
+                <w:b w:val="0"/>
+                <w:color w:val="131B2E"/>
+                <w:sz w:val="15"/>
+              </w:rPr>
+              <w:t>84.0</w:t>
+            </w:r>
+          </w:p>
+        </w:tc>
+        <w:tc>
+          <w:tcPr>
+            <w:tcW w:type="dxa" w:w="1134"/>
+            <w:shd w:val="clear" w:fill="E0F3E6"/>
+          </w:tcPr>
+          <w:p>
+            <w:pPr>
+              <w:spacing w:after="20"/>
+            </w:pPr>
+            <w:r/>
+            <w:r>
+              <w:rPr>
+                <w:b w:val="0"/>
+                <w:color w:val="131B2E"/>
+                <w:sz w:val="15"/>
+              </w:rPr>
+              <w:t>Diamante</w:t>
+            </w:r>
+          </w:p>
+        </w:tc>
+        <w:tc>
+          <w:tcPr>
+            <w:tcW w:type="dxa" w:w="1077"/>
+            <w:shd w:val="clear" w:fill="E0F3E6"/>
+          </w:tcPr>
+          <w:p>
+            <w:pPr>
+              <w:spacing w:after="20"/>
+            </w:pPr>
+            <w:r/>
+            <w:r>
+              <w:rPr>
+                <w:b w:val="0"/>
+                <w:color w:val="131B2E"/>
+                <w:sz w:val="15"/>
+              </w:rPr>
+              <w:t>SÍ</w:t>
+            </w:r>
+          </w:p>
+        </w:tc>
+        <w:tc>
+          <w:tcPr>
+            <w:tcW w:type="dxa" w:w="4762"/>
+            <w:shd w:val="clear" w:fill="E0F3E6"/>
+          </w:tcPr>
+          <w:p>
+            <w:pPr>
+              <w:spacing w:after="20"/>
+            </w:pPr>
+            <w:r/>
+            <w:r>
+              <w:rPr>
+                <w:b w:val="0"/>
+                <w:color w:val="131B2E"/>
+                <w:sz w:val="15"/>
+              </w:rPr>
+              <w:t>El acceso abierto más sólido de los cuatro: diamante, CC BY-SA, cero cerrados y declaración explícita en portada. Segundo mejor puntaje absoluto y 682 artículos en 2025. Su única objeción es administrativa: está en la lista.</w:t>
+            </w:r>
+          </w:p>
+        </w:tc>
+      </w:tr>
+      <w:tr>
+        <w:tc>
+          <w:tcPr>
+            <w:tcW w:type="dxa" w:w="1020"/>
+            <w:shd w:val="clear" w:fill="E0F3E6"/>
+          </w:tcPr>
+          <w:p>
+            <w:pPr>
+              <w:spacing w:after="20"/>
+            </w:pPr>
+            <w:r/>
+            <w:r>
+              <w:rPr>
+                <w:b w:val="0"/>
+                <w:color w:val="131B2E"/>
+                <w:sz w:val="15"/>
+              </w:rPr>
+              <w:t>Plan D</w:t>
+            </w:r>
+          </w:p>
+        </w:tc>
+        <w:tc>
+          <w:tcPr>
+            <w:tcW w:type="dxa" w:w="1134"/>
+            <w:shd w:val="clear" w:fill="E0F3E6"/>
+          </w:tcPr>
+          <w:p>
+            <w:pPr>
+              <w:spacing w:after="20"/>
+            </w:pPr>
+            <w:r/>
+            <w:r>
+              <w:rPr>
+                <w:b w:val="0"/>
+                <w:color w:val="131B2E"/>
+                <w:sz w:val="15"/>
+              </w:rPr>
+              <w:t>IJSSE</w:t>
+            </w:r>
+          </w:p>
+        </w:tc>
+        <w:tc>
+          <w:tcPr>
+            <w:tcW w:type="dxa" w:w="964"/>
+            <w:shd w:val="clear" w:fill="E0F3E6"/>
+          </w:tcPr>
+          <w:p>
+            <w:pPr>
+              <w:spacing w:after="20"/>
+            </w:pPr>
+            <w:r/>
+            <w:r>
+              <w:rPr>
+                <w:b w:val="0"/>
+                <w:color w:val="131B2E"/>
+                <w:sz w:val="15"/>
+              </w:rPr>
+              <w:t>75.5</w:t>
+            </w:r>
+          </w:p>
+        </w:tc>
+        <w:tc>
+          <w:tcPr>
+            <w:tcW w:type="dxa" w:w="1134"/>
+            <w:shd w:val="clear" w:fill="E0F3E6"/>
+          </w:tcPr>
+          <w:p>
+            <w:pPr>
+              <w:spacing w:after="20"/>
+            </w:pPr>
+            <w:r/>
+            <w:r>
+              <w:rPr>
+                <w:b w:val="0"/>
+                <w:color w:val="131B2E"/>
+                <w:sz w:val="15"/>
+              </w:rPr>
+              <w:t>Híbrido</w:t>
+            </w:r>
+          </w:p>
+        </w:tc>
+        <w:tc>
+          <w:tcPr>
+            <w:tcW w:type="dxa" w:w="1077"/>
+            <w:shd w:val="clear" w:fill="E0F3E6"/>
+          </w:tcPr>
+          <w:p>
+            <w:pPr>
+              <w:spacing w:after="20"/>
+            </w:pPr>
+            <w:r/>
+            <w:r>
+              <w:rPr>
+                <w:b w:val="0"/>
+                <w:color w:val="131B2E"/>
+                <w:sz w:val="15"/>
+              </w:rPr>
+              <w:t>SÍ</w:t>
+            </w:r>
+          </w:p>
+        </w:tc>
+        <w:tc>
+          <w:tcPr>
+            <w:tcW w:type="dxa" w:w="4762"/>
+            <w:shd w:val="clear" w:fill="E0F3E6"/>
+          </w:tcPr>
+          <w:p>
+            <w:pPr>
+              <w:spacing w:after="20"/>
+            </w:pPr>
+            <w:r/>
+            <w:r>
+              <w:rPr>
+                <w:b w:val="0"/>
+                <w:color w:val="131B2E"/>
+                <w:sz w:val="15"/>
+              </w:rPr>
+              <w:t>Encaje idéntico al de BEEI, ciclo rápido y licencia CC BY. Menor visibilidad (CiteScore 2,8 frente a 4,2) y APC del doble. También está en la lista.</w:t>
+            </w:r>
+          </w:p>
+        </w:tc>
+      </w:tr>
+    </w:tbl>
+    <w:p>
+      <w:pPr>
+        <w:spacing w:after="40"/>
+      </w:pPr>
+    </w:p>
+    <w:p>
+      <w:pPr>
+        <w:spacing w:after="80"/>
+        <w:jc w:val="both"/>
+      </w:pPr>
+      <w:r>
+        <w:rPr>
+          <w:b w:val="0"/>
+          <w:i/>
+          <w:color w:val="5B6B8C"/>
+          <w:sz w:val="16"/>
+        </w:rPr>
+        <w:t>Dos tensiones que el autor asume. (1) El Plan A es el acceso abierto más débil de los cuatro: IJIES encabeza por puntaje, volumen y precio, pero su acceso es bronce sin licencia y fuera de DOAJ; BEEI, el Plan C, es el más sólido en esto. Si se busca acceso abierto en sentido estricto, el orden se invertiría. (2) Los Planes C y D figuran en la lista de control de la coordinación, y volver a incluirlos depende de una pregunta sin responder: si la lista inhabilita la revista o solo registra lo ya publicado.</w:t>
+      </w:r>
+    </w:p>
+    <w:p>
+      <w:pPr>
+        <w:spacing w:before="180" w:after="60"/>
+      </w:pPr>
+      <w:r>
+        <w:rPr>
+          <w:b/>
+          <w:color w:val="1F4E79"/>
+          <w:sz w:val="23"/>
+        </w:rPr>
+        <w:t>7 · Justificación</w:t>
       </w:r>
     </w:p>
     <w:p>
@@ -4784,7 +5508,7 @@
           <w:color w:val="131B2E"/>
           <w:sz w:val="17"/>
         </w:rPr>
-        <w:t>, por delante de ISJ (81.0), y es la única candidata que supera a BEEI (87.5) en puntuación absoluta.</w:t>
+        <w:t>, la puntuación más alta de las nueve, por delante de BEEI (84.0). Es además la única de las cuatro elegidas sin objeción administrativa pendiente.</w:t>
       </w:r>
     </w:p>
     <w:p>

</xml_diff>